<commit_message>
added github link in the document
</commit_message>
<xml_diff>
--- a/Lab 1/202612050.docx
+++ b/Lab 1/202612050.docx
@@ -50,6 +50,27 @@
         </w:rPr>
         <w:t>202612050</w:t>
       </w:r>
+      <w:r>
+        <w:rPr>
+          <w:b/>
+          <w:bCs/>
+          <w:sz w:val="22"/>
+          <w:szCs w:val="24"/>
+        </w:rPr>
+        <w:t xml:space="preserve"> | </w:t>
+      </w:r>
+      <w:hyperlink r:id="rId7" w:history="1">
+        <w:r>
+          <w:rPr>
+            <w:rStyle w:val="Hyperlink"/>
+            <w:b/>
+            <w:bCs/>
+            <w:sz w:val="22"/>
+            <w:szCs w:val="24"/>
+          </w:rPr>
+          <w:t>Kunal-63/202612050-IT603</w:t>
+        </w:r>
+      </w:hyperlink>
     </w:p>
     <w:p>
       <w:pPr>
@@ -65,6 +86,7 @@
       <w:r>
         <w:rPr>
           <w:rFonts w:ascii="Lucida Console" w:hAnsi="Lucida Console" w:cs="Lucida Console"/>
+          <w:noProof/>
           <w:color w:val="1CA800"/>
           <w:kern w:val="0"/>
           <w:sz w:val="18"/>
@@ -87,7 +109,7 @@
                     <pic:cNvPicPr/>
                   </pic:nvPicPr>
                   <pic:blipFill>
-                    <a:blip r:embed="rId7"/>
+                    <a:blip r:embed="rId8"/>
                     <a:stretch>
                       <a:fillRect/>
                     </a:stretch>
@@ -133,6 +155,7 @@
       <w:r>
         <w:rPr>
           <w:rFonts w:ascii="Lucida Console" w:hAnsi="Lucida Console" w:cs="Lucida Console"/>
+          <w:noProof/>
           <w:color w:val="1CA800"/>
           <w:kern w:val="0"/>
           <w:sz w:val="18"/>
@@ -155,7 +178,7 @@
                     <pic:cNvPicPr/>
                   </pic:nvPicPr>
                   <pic:blipFill>
-                    <a:blip r:embed="rId8"/>
+                    <a:blip r:embed="rId9"/>
                     <a:stretch>
                       <a:fillRect/>
                     </a:stretch>
@@ -210,7 +233,7 @@
                     <pic:cNvPicPr/>
                   </pic:nvPicPr>
                   <pic:blipFill>
-                    <a:blip r:embed="rId9"/>
+                    <a:blip r:embed="rId10"/>
                     <a:stretch>
                       <a:fillRect/>
                     </a:stretch>
@@ -265,7 +288,7 @@
                     <pic:cNvPicPr/>
                   </pic:nvPicPr>
                   <pic:blipFill>
-                    <a:blip r:embed="rId10"/>
+                    <a:blip r:embed="rId11"/>
                     <a:stretch>
                       <a:fillRect/>
                     </a:stretch>
@@ -477,6 +500,7 @@
       <w:r>
         <w:rPr>
           <w:rFonts w:ascii="Lucida Console" w:hAnsi="Lucida Console" w:cs="Lucida Console"/>
+          <w:noProof/>
           <w:color w:val="1CA800"/>
           <w:kern w:val="0"/>
           <w:sz w:val="18"/>
@@ -500,7 +524,7 @@
                     <pic:cNvPicPr/>
                   </pic:nvPicPr>
                   <pic:blipFill>
-                    <a:blip r:embed="rId11"/>
+                    <a:blip r:embed="rId12"/>
                     <a:stretch>
                       <a:fillRect/>
                     </a:stretch>
@@ -789,6 +813,7 @@
       <w:r>
         <w:rPr>
           <w:rFonts w:ascii="Lucida Console" w:hAnsi="Lucida Console" w:cs="Lucida Console"/>
+          <w:noProof/>
           <w:color w:val="1CA800"/>
           <w:kern w:val="0"/>
           <w:sz w:val="18"/>
@@ -811,7 +836,7 @@
                     <pic:cNvPicPr/>
                   </pic:nvPicPr>
                   <pic:blipFill>
-                    <a:blip r:embed="rId12"/>
+                    <a:blip r:embed="rId13"/>
                     <a:stretch>
                       <a:fillRect/>
                     </a:stretch>
@@ -1058,7 +1083,7 @@
                     <pic:cNvPicPr/>
                   </pic:nvPicPr>
                   <pic:blipFill>
-                    <a:blip r:embed="rId13"/>
+                    <a:blip r:embed="rId14"/>
                     <a:stretch>
                       <a:fillRect/>
                     </a:stretch>
@@ -1232,7 +1257,7 @@
                     <pic:cNvPicPr/>
                   </pic:nvPicPr>
                   <pic:blipFill>
-                    <a:blip r:embed="rId14"/>
+                    <a:blip r:embed="rId15"/>
                     <a:stretch>
                       <a:fillRect/>
                     </a:stretch>
@@ -1503,7 +1528,7 @@
                     <pic:cNvPicPr/>
                   </pic:nvPicPr>
                   <pic:blipFill>
-                    <a:blip r:embed="rId15"/>
+                    <a:blip r:embed="rId16"/>
                     <a:stretch>
                       <a:fillRect/>
                     </a:stretch>
@@ -1798,7 +1823,7 @@
                     <pic:cNvPicPr/>
                   </pic:nvPicPr>
                   <pic:blipFill>
-                    <a:blip r:embed="rId16"/>
+                    <a:blip r:embed="rId17"/>
                     <a:stretch>
                       <a:fillRect/>
                     </a:stretch>
@@ -1948,7 +1973,7 @@
                     <pic:cNvPicPr/>
                   </pic:nvPicPr>
                   <pic:blipFill>
-                    <a:blip r:embed="rId17"/>
+                    <a:blip r:embed="rId18"/>
                     <a:stretch>
                       <a:fillRect/>
                     </a:stretch>
@@ -2001,7 +2026,7 @@
                     <pic:cNvPicPr/>
                   </pic:nvPicPr>
                   <pic:blipFill>
-                    <a:blip r:embed="rId18"/>
+                    <a:blip r:embed="rId19"/>
                     <a:stretch>
                       <a:fillRect/>
                     </a:stretch>
@@ -2272,7 +2297,7 @@
                     <pic:cNvPicPr/>
                   </pic:nvPicPr>
                   <pic:blipFill>
-                    <a:blip r:embed="rId19"/>
+                    <a:blip r:embed="rId20"/>
                     <a:stretch>
                       <a:fillRect/>
                     </a:stretch>
@@ -2676,6 +2701,7 @@
         <w:rPr>
           <w:b/>
           <w:bCs/>
+          <w:noProof/>
           <w:sz w:val="22"/>
           <w:szCs w:val="24"/>
         </w:rPr>
@@ -2695,7 +2721,7 @@
                     <pic:cNvPicPr/>
                   </pic:nvPicPr>
                   <pic:blipFill>
-                    <a:blip r:embed="rId20"/>
+                    <a:blip r:embed="rId21"/>
                     <a:stretch>
                       <a:fillRect/>
                     </a:stretch>
@@ -2729,6 +2755,7 @@
         <w:rPr>
           <w:b/>
           <w:bCs/>
+          <w:noProof/>
           <w:sz w:val="22"/>
           <w:szCs w:val="24"/>
         </w:rPr>
@@ -2748,7 +2775,7 @@
                     <pic:cNvPicPr/>
                   </pic:nvPicPr>
                   <pic:blipFill>
-                    <a:blip r:embed="rId21"/>
+                    <a:blip r:embed="rId22"/>
                     <a:stretch>
                       <a:fillRect/>
                     </a:stretch>
@@ -3248,6 +3275,7 @@
         <w:rPr>
           <w:b/>
           <w:bCs/>
+          <w:noProof/>
           <w:sz w:val="22"/>
           <w:szCs w:val="24"/>
         </w:rPr>
@@ -3268,7 +3296,7 @@
                     <pic:cNvPicPr/>
                   </pic:nvPicPr>
                   <pic:blipFill>
-                    <a:blip r:embed="rId22"/>
+                    <a:blip r:embed="rId23"/>
                     <a:stretch>
                       <a:fillRect/>
                     </a:stretch>
@@ -3290,8 +3318,8 @@
       </w:r>
     </w:p>
     <w:sectPr>
-      <w:headerReference w:type="default" r:id="rId23"/>
-      <w:footerReference w:type="default" r:id="rId24"/>
+      <w:headerReference w:type="default" r:id="rId24"/>
+      <w:footerReference w:type="default" r:id="rId25"/>
       <w:pgSz w:w="12240" w:h="15840"/>
       <w:pgMar w:top="1440" w:right="1440" w:bottom="1440" w:left="1440" w:header="720" w:footer="720" w:gutter="0"/>
       <w:cols w:space="720"/>
@@ -4135,7 +4163,6 @@
   <w:style w:type="character" w:default="1" w:styleId="DefaultParagraphFont">
     <w:name w:val="Default Paragraph Font"/>
     <w:uiPriority w:val="1"/>
-    <w:semiHidden/>
     <w:unhideWhenUsed/>
   </w:style>
   <w:style w:type="table" w:default="1" w:styleId="TableNormal">
@@ -4493,6 +4520,29 @@
     <w:uiPriority w:val="99"/>
     <w:rsid w:val="00355529"/>
   </w:style>
+  <w:style w:type="character" w:styleId="Hyperlink">
+    <w:name w:val="Hyperlink"/>
+    <w:basedOn w:val="DefaultParagraphFont"/>
+    <w:uiPriority w:val="99"/>
+    <w:unhideWhenUsed/>
+    <w:rsid w:val="00C80282"/>
+    <w:rPr>
+      <w:color w:val="467886" w:themeColor="hyperlink"/>
+      <w:u w:val="single"/>
+    </w:rPr>
+  </w:style>
+  <w:style w:type="character" w:styleId="UnresolvedMention">
+    <w:name w:val="Unresolved Mention"/>
+    <w:basedOn w:val="DefaultParagraphFont"/>
+    <w:uiPriority w:val="99"/>
+    <w:semiHidden/>
+    <w:unhideWhenUsed/>
+    <w:rsid w:val="00C80282"/>
+    <w:rPr>
+      <w:color w:val="605E5C"/>
+      <w:shd w:val="clear" w:color="auto" w:fill="E1DFDD"/>
+    </w:rPr>
+  </w:style>
 </w:styles>
 </file>
 

</xml_diff>

<commit_message>
Lab 1 doc fixes
</commit_message>
<xml_diff>
--- a/Lab 1/202612050.docx
+++ b/Lab 1/202612050.docx
@@ -1993,6 +1993,60 @@
           </wp:inline>
         </w:drawing>
       </w:r>
+    </w:p>
+    <w:p>
+      <w:pPr>
+        <w:rPr>
+          <w:b/>
+          <w:bCs/>
+          <w:sz w:val="22"/>
+          <w:szCs w:val="24"/>
+        </w:rPr>
+      </w:pPr>
+      <w:r>
+        <w:rPr>
+          <w:b/>
+          <w:bCs/>
+          <w:sz w:val="22"/>
+          <w:szCs w:val="24"/>
+        </w:rPr>
+        <w:lastRenderedPageBreak/>
+        <w:drawing>
+          <wp:inline distT="0" distB="0" distL="0" distR="0" wp14:anchorId="5699C5E3" wp14:editId="274C9463">
+            <wp:extent cx="5943600" cy="4211955"/>
+            <wp:effectExtent l="0" t="0" r="0" b="0"/>
+            <wp:docPr id="568166139" name="Picture 1"/>
+            <wp:cNvGraphicFramePr>
+              <a:graphicFrameLocks xmlns:a="http://schemas.openxmlformats.org/drawingml/2006/main" noChangeAspect="1"/>
+            </wp:cNvGraphicFramePr>
+            <a:graphic xmlns:a="http://schemas.openxmlformats.org/drawingml/2006/main">
+              <a:graphicData uri="http://schemas.openxmlformats.org/drawingml/2006/picture">
+                <pic:pic xmlns:pic="http://schemas.openxmlformats.org/drawingml/2006/picture">
+                  <pic:nvPicPr>
+                    <pic:cNvPr id="568166139" name=""/>
+                    <pic:cNvPicPr/>
+                  </pic:nvPicPr>
+                  <pic:blipFill>
+                    <a:blip r:embed="rId19"/>
+                    <a:stretch>
+                      <a:fillRect/>
+                    </a:stretch>
+                  </pic:blipFill>
+                  <pic:spPr>
+                    <a:xfrm>
+                      <a:off x="0" y="0"/>
+                      <a:ext cx="5943600" cy="4211955"/>
+                    </a:xfrm>
+                    <a:prstGeom prst="rect">
+                      <a:avLst/>
+                    </a:prstGeom>
+                  </pic:spPr>
+                </pic:pic>
+              </a:graphicData>
+            </a:graphic>
+          </wp:inline>
+        </w:drawing>
+      </w:r>
       <w:r>
         <w:rPr>
           <w:b/>
@@ -2026,7 +2080,7 @@
                     <pic:cNvPicPr/>
                   </pic:nvPicPr>
                   <pic:blipFill>
-                    <a:blip r:embed="rId19"/>
+                    <a:blip r:embed="rId20"/>
                     <a:stretch>
                       <a:fillRect/>
                     </a:stretch>
@@ -2140,147 +2194,147 @@
           <w:sz w:val="22"/>
           <w:szCs w:val="24"/>
         </w:rPr>
+        <w:t xml:space="preserve"> Initialize a Git repository.</w:t>
+      </w:r>
+    </w:p>
+    <w:p>
+      <w:pPr>
+        <w:pStyle w:val="ListParagraph"/>
+        <w:numPr>
+          <w:ilvl w:val="2"/>
+          <w:numId w:val="1"/>
+        </w:numPr>
+        <w:rPr>
+          <w:b/>
+          <w:bCs/>
+          <w:sz w:val="22"/>
+          <w:szCs w:val="24"/>
+        </w:rPr>
+      </w:pPr>
+      <w:r>
+        <w:rPr>
+          <w:b/>
+          <w:bCs/>
+          <w:sz w:val="22"/>
+          <w:szCs w:val="24"/>
+        </w:rPr>
+        <w:t>Create a file named readme.md.</w:t>
+      </w:r>
+    </w:p>
+    <w:p>
+      <w:pPr>
+        <w:pStyle w:val="ListParagraph"/>
+        <w:numPr>
+          <w:ilvl w:val="2"/>
+          <w:numId w:val="1"/>
+        </w:numPr>
+        <w:rPr>
+          <w:b/>
+          <w:bCs/>
+          <w:sz w:val="22"/>
+          <w:szCs w:val="24"/>
+        </w:rPr>
+      </w:pPr>
+      <w:r>
+        <w:rPr>
+          <w:b/>
+          <w:bCs/>
+          <w:sz w:val="22"/>
+          <w:szCs w:val="24"/>
+        </w:rPr>
+        <w:t>Stage the file.</w:t>
+      </w:r>
+    </w:p>
+    <w:p>
+      <w:pPr>
+        <w:pStyle w:val="ListParagraph"/>
+        <w:numPr>
+          <w:ilvl w:val="2"/>
+          <w:numId w:val="1"/>
+        </w:numPr>
+        <w:rPr>
+          <w:b/>
+          <w:bCs/>
+          <w:sz w:val="22"/>
+          <w:szCs w:val="24"/>
+        </w:rPr>
+      </w:pPr>
+      <w:r>
+        <w:rPr>
+          <w:b/>
+          <w:bCs/>
+          <w:sz w:val="22"/>
+          <w:szCs w:val="24"/>
+        </w:rPr>
+        <w:t>Commit the changes with the message First Commit.</w:t>
+      </w:r>
+    </w:p>
+    <w:p>
+      <w:pPr>
+        <w:pStyle w:val="ListParagraph"/>
+        <w:numPr>
+          <w:ilvl w:val="2"/>
+          <w:numId w:val="1"/>
+        </w:numPr>
+        <w:rPr>
+          <w:b/>
+          <w:bCs/>
+          <w:sz w:val="22"/>
+          <w:szCs w:val="24"/>
+        </w:rPr>
+      </w:pPr>
+      <w:r>
+        <w:rPr>
+          <w:b/>
+          <w:bCs/>
+          <w:sz w:val="22"/>
+          <w:szCs w:val="24"/>
+        </w:rPr>
+        <w:t>Display the repository status.</w:t>
+      </w:r>
+    </w:p>
+    <w:p>
+      <w:pPr>
+        <w:pStyle w:val="ListParagraph"/>
+        <w:numPr>
+          <w:ilvl w:val="2"/>
+          <w:numId w:val="1"/>
+        </w:numPr>
+        <w:rPr>
+          <w:b/>
+          <w:bCs/>
+          <w:sz w:val="22"/>
+          <w:szCs w:val="24"/>
+        </w:rPr>
+      </w:pPr>
+      <w:r>
+        <w:rPr>
+          <w:b/>
+          <w:bCs/>
+          <w:sz w:val="22"/>
+          <w:szCs w:val="24"/>
+        </w:rPr>
+        <w:t>Display the commit history.</w:t>
+      </w:r>
+    </w:p>
+    <w:p>
+      <w:pPr>
+        <w:rPr>
+          <w:b/>
+          <w:bCs/>
+          <w:sz w:val="22"/>
+          <w:szCs w:val="24"/>
+        </w:rPr>
+      </w:pPr>
+      <w:r>
+        <w:rPr>
+          <w:b/>
+          <w:bCs/>
+          <w:noProof/>
+          <w:sz w:val="22"/>
+          <w:szCs w:val="24"/>
+        </w:rPr>
         <w:lastRenderedPageBreak/>
-        <w:t xml:space="preserve"> Initialize a Git repository.</w:t>
-      </w:r>
-    </w:p>
-    <w:p>
-      <w:pPr>
-        <w:pStyle w:val="ListParagraph"/>
-        <w:numPr>
-          <w:ilvl w:val="2"/>
-          <w:numId w:val="1"/>
-        </w:numPr>
-        <w:rPr>
-          <w:b/>
-          <w:bCs/>
-          <w:sz w:val="22"/>
-          <w:szCs w:val="24"/>
-        </w:rPr>
-      </w:pPr>
-      <w:r>
-        <w:rPr>
-          <w:b/>
-          <w:bCs/>
-          <w:sz w:val="22"/>
-          <w:szCs w:val="24"/>
-        </w:rPr>
-        <w:t>Create a file named readme.md.</w:t>
-      </w:r>
-    </w:p>
-    <w:p>
-      <w:pPr>
-        <w:pStyle w:val="ListParagraph"/>
-        <w:numPr>
-          <w:ilvl w:val="2"/>
-          <w:numId w:val="1"/>
-        </w:numPr>
-        <w:rPr>
-          <w:b/>
-          <w:bCs/>
-          <w:sz w:val="22"/>
-          <w:szCs w:val="24"/>
-        </w:rPr>
-      </w:pPr>
-      <w:r>
-        <w:rPr>
-          <w:b/>
-          <w:bCs/>
-          <w:sz w:val="22"/>
-          <w:szCs w:val="24"/>
-        </w:rPr>
-        <w:t>Stage the file.</w:t>
-      </w:r>
-    </w:p>
-    <w:p>
-      <w:pPr>
-        <w:pStyle w:val="ListParagraph"/>
-        <w:numPr>
-          <w:ilvl w:val="2"/>
-          <w:numId w:val="1"/>
-        </w:numPr>
-        <w:rPr>
-          <w:b/>
-          <w:bCs/>
-          <w:sz w:val="22"/>
-          <w:szCs w:val="24"/>
-        </w:rPr>
-      </w:pPr>
-      <w:r>
-        <w:rPr>
-          <w:b/>
-          <w:bCs/>
-          <w:sz w:val="22"/>
-          <w:szCs w:val="24"/>
-        </w:rPr>
-        <w:t>Commit the changes with the message First Commit.</w:t>
-      </w:r>
-    </w:p>
-    <w:p>
-      <w:pPr>
-        <w:pStyle w:val="ListParagraph"/>
-        <w:numPr>
-          <w:ilvl w:val="2"/>
-          <w:numId w:val="1"/>
-        </w:numPr>
-        <w:rPr>
-          <w:b/>
-          <w:bCs/>
-          <w:sz w:val="22"/>
-          <w:szCs w:val="24"/>
-        </w:rPr>
-      </w:pPr>
-      <w:r>
-        <w:rPr>
-          <w:b/>
-          <w:bCs/>
-          <w:sz w:val="22"/>
-          <w:szCs w:val="24"/>
-        </w:rPr>
-        <w:t>Display the repository status.</w:t>
-      </w:r>
-    </w:p>
-    <w:p>
-      <w:pPr>
-        <w:pStyle w:val="ListParagraph"/>
-        <w:numPr>
-          <w:ilvl w:val="2"/>
-          <w:numId w:val="1"/>
-        </w:numPr>
-        <w:rPr>
-          <w:b/>
-          <w:bCs/>
-          <w:sz w:val="22"/>
-          <w:szCs w:val="24"/>
-        </w:rPr>
-      </w:pPr>
-      <w:r>
-        <w:rPr>
-          <w:b/>
-          <w:bCs/>
-          <w:sz w:val="22"/>
-          <w:szCs w:val="24"/>
-        </w:rPr>
-        <w:t>Display the commit history.</w:t>
-      </w:r>
-    </w:p>
-    <w:p>
-      <w:pPr>
-        <w:rPr>
-          <w:b/>
-          <w:bCs/>
-          <w:sz w:val="22"/>
-          <w:szCs w:val="24"/>
-        </w:rPr>
-      </w:pPr>
-      <w:r>
-        <w:rPr>
-          <w:b/>
-          <w:bCs/>
-          <w:noProof/>
-          <w:sz w:val="22"/>
-          <w:szCs w:val="24"/>
-        </w:rPr>
         <w:drawing>
           <wp:inline distT="0" distB="0" distL="0" distR="0" wp14:anchorId="366D6260" wp14:editId="162A1F2E">
             <wp:extent cx="5943600" cy="6880860"/>
@@ -2297,7 +2351,7 @@
                     <pic:cNvPicPr/>
                   </pic:nvPicPr>
                   <pic:blipFill>
-                    <a:blip r:embed="rId20"/>
+                    <a:blip r:embed="rId21"/>
                     <a:stretch>
                       <a:fillRect/>
                     </a:stretch>
@@ -2339,151 +2393,151 @@
           <w:sz w:val="22"/>
           <w:szCs w:val="24"/>
         </w:rPr>
+        <w:t>Mini Linux Project</w:t>
+      </w:r>
+    </w:p>
+    <w:p>
+      <w:pPr>
+        <w:pStyle w:val="ListParagraph"/>
+        <w:numPr>
+          <w:ilvl w:val="1"/>
+          <w:numId w:val="1"/>
+        </w:numPr>
+        <w:rPr>
+          <w:b/>
+          <w:bCs/>
+          <w:sz w:val="22"/>
+          <w:szCs w:val="24"/>
+        </w:rPr>
+      </w:pPr>
+      <w:r>
+        <w:rPr>
+          <w:b/>
+          <w:bCs/>
+          <w:sz w:val="22"/>
+          <w:szCs w:val="24"/>
+        </w:rPr>
+        <w:t>Create the following directory structure:</w:t>
+      </w:r>
+    </w:p>
+    <w:p>
+      <w:pPr>
+        <w:pStyle w:val="ListParagraph"/>
+        <w:numPr>
+          <w:ilvl w:val="1"/>
+          <w:numId w:val="1"/>
+        </w:numPr>
+        <w:rPr>
+          <w:b/>
+          <w:bCs/>
+          <w:sz w:val="22"/>
+          <w:szCs w:val="24"/>
+        </w:rPr>
+      </w:pPr>
+      <w:r>
+        <w:rPr>
+          <w:b/>
+          <w:bCs/>
+          <w:sz w:val="22"/>
+          <w:szCs w:val="24"/>
+        </w:rPr>
+        <w:t>Library</w:t>
+      </w:r>
+    </w:p>
+    <w:p>
+      <w:pPr>
+        <w:pStyle w:val="ListParagraph"/>
+        <w:numPr>
+          <w:ilvl w:val="2"/>
+          <w:numId w:val="1"/>
+        </w:numPr>
+        <w:rPr>
+          <w:b/>
+          <w:bCs/>
+          <w:sz w:val="22"/>
+          <w:szCs w:val="24"/>
+        </w:rPr>
+      </w:pPr>
+      <w:r>
+        <w:rPr>
+          <w:b/>
+          <w:bCs/>
+          <w:sz w:val="22"/>
+          <w:szCs w:val="24"/>
+        </w:rPr>
+        <w:t>Books</w:t>
+      </w:r>
+    </w:p>
+    <w:p>
+      <w:pPr>
+        <w:pStyle w:val="ListParagraph"/>
+        <w:numPr>
+          <w:ilvl w:val="2"/>
+          <w:numId w:val="1"/>
+        </w:numPr>
+        <w:rPr>
+          <w:b/>
+          <w:bCs/>
+          <w:sz w:val="22"/>
+          <w:szCs w:val="24"/>
+        </w:rPr>
+      </w:pPr>
+      <w:r>
+        <w:rPr>
+          <w:b/>
+          <w:bCs/>
+          <w:sz w:val="22"/>
+          <w:szCs w:val="24"/>
+        </w:rPr>
+        <w:t>Notes</w:t>
+      </w:r>
+    </w:p>
+    <w:p>
+      <w:pPr>
+        <w:pStyle w:val="ListParagraph"/>
+        <w:numPr>
+          <w:ilvl w:val="2"/>
+          <w:numId w:val="1"/>
+        </w:numPr>
+        <w:rPr>
+          <w:b/>
+          <w:bCs/>
+          <w:sz w:val="22"/>
+          <w:szCs w:val="24"/>
+        </w:rPr>
+      </w:pPr>
+      <w:r>
+        <w:rPr>
+          <w:b/>
+          <w:bCs/>
+          <w:sz w:val="22"/>
+          <w:szCs w:val="24"/>
+        </w:rPr>
+        <w:t>Assignments</w:t>
+      </w:r>
+    </w:p>
+    <w:p>
+      <w:pPr>
+        <w:pStyle w:val="ListParagraph"/>
+        <w:numPr>
+          <w:ilvl w:val="1"/>
+          <w:numId w:val="1"/>
+        </w:numPr>
+        <w:rPr>
+          <w:b/>
+          <w:bCs/>
+          <w:sz w:val="22"/>
+          <w:szCs w:val="24"/>
+        </w:rPr>
+      </w:pPr>
+      <w:r>
+        <w:rPr>
+          <w:b/>
+          <w:bCs/>
+          <w:sz w:val="22"/>
+          <w:szCs w:val="24"/>
+        </w:rPr>
         <w:lastRenderedPageBreak/>
-        <w:t>Mini Linux Project</w:t>
-      </w:r>
-    </w:p>
-    <w:p>
-      <w:pPr>
-        <w:pStyle w:val="ListParagraph"/>
-        <w:numPr>
-          <w:ilvl w:val="1"/>
-          <w:numId w:val="1"/>
-        </w:numPr>
-        <w:rPr>
-          <w:b/>
-          <w:bCs/>
-          <w:sz w:val="22"/>
-          <w:szCs w:val="24"/>
-        </w:rPr>
-      </w:pPr>
-      <w:r>
-        <w:rPr>
-          <w:b/>
-          <w:bCs/>
-          <w:sz w:val="22"/>
-          <w:szCs w:val="24"/>
-        </w:rPr>
-        <w:t>Create the following directory structure:</w:t>
-      </w:r>
-    </w:p>
-    <w:p>
-      <w:pPr>
-        <w:pStyle w:val="ListParagraph"/>
-        <w:numPr>
-          <w:ilvl w:val="1"/>
-          <w:numId w:val="1"/>
-        </w:numPr>
-        <w:rPr>
-          <w:b/>
-          <w:bCs/>
-          <w:sz w:val="22"/>
-          <w:szCs w:val="24"/>
-        </w:rPr>
-      </w:pPr>
-      <w:r>
-        <w:rPr>
-          <w:b/>
-          <w:bCs/>
-          <w:sz w:val="22"/>
-          <w:szCs w:val="24"/>
-        </w:rPr>
-        <w:t>Library</w:t>
-      </w:r>
-    </w:p>
-    <w:p>
-      <w:pPr>
-        <w:pStyle w:val="ListParagraph"/>
-        <w:numPr>
-          <w:ilvl w:val="2"/>
-          <w:numId w:val="1"/>
-        </w:numPr>
-        <w:rPr>
-          <w:b/>
-          <w:bCs/>
-          <w:sz w:val="22"/>
-          <w:szCs w:val="24"/>
-        </w:rPr>
-      </w:pPr>
-      <w:r>
-        <w:rPr>
-          <w:b/>
-          <w:bCs/>
-          <w:sz w:val="22"/>
-          <w:szCs w:val="24"/>
-        </w:rPr>
-        <w:t>Books</w:t>
-      </w:r>
-    </w:p>
-    <w:p>
-      <w:pPr>
-        <w:pStyle w:val="ListParagraph"/>
-        <w:numPr>
-          <w:ilvl w:val="2"/>
-          <w:numId w:val="1"/>
-        </w:numPr>
-        <w:rPr>
-          <w:b/>
-          <w:bCs/>
-          <w:sz w:val="22"/>
-          <w:szCs w:val="24"/>
-        </w:rPr>
-      </w:pPr>
-      <w:r>
-        <w:rPr>
-          <w:b/>
-          <w:bCs/>
-          <w:sz w:val="22"/>
-          <w:szCs w:val="24"/>
-        </w:rPr>
-        <w:t>Notes</w:t>
-      </w:r>
-    </w:p>
-    <w:p>
-      <w:pPr>
-        <w:pStyle w:val="ListParagraph"/>
-        <w:numPr>
-          <w:ilvl w:val="2"/>
-          <w:numId w:val="1"/>
-        </w:numPr>
-        <w:rPr>
-          <w:b/>
-          <w:bCs/>
-          <w:sz w:val="22"/>
-          <w:szCs w:val="24"/>
-        </w:rPr>
-      </w:pPr>
-      <w:r>
-        <w:rPr>
-          <w:b/>
-          <w:bCs/>
-          <w:sz w:val="22"/>
-          <w:szCs w:val="24"/>
-        </w:rPr>
-        <w:t>Assignments</w:t>
-      </w:r>
-    </w:p>
-    <w:p>
-      <w:pPr>
-        <w:pStyle w:val="ListParagraph"/>
-        <w:numPr>
-          <w:ilvl w:val="1"/>
-          <w:numId w:val="1"/>
-        </w:numPr>
-        <w:rPr>
-          <w:b/>
-          <w:bCs/>
-          <w:sz w:val="22"/>
-          <w:szCs w:val="24"/>
-        </w:rPr>
-      </w:pPr>
-      <w:r>
-        <w:rPr>
-          <w:b/>
-          <w:bCs/>
-          <w:sz w:val="22"/>
-          <w:szCs w:val="24"/>
-        </w:rPr>
         <w:t>Perform the following tasks:</w:t>
       </w:r>
     </w:p>
@@ -2721,7 +2775,7 @@
                     <pic:cNvPicPr/>
                   </pic:nvPicPr>
                   <pic:blipFill>
-                    <a:blip r:embed="rId21"/>
+                    <a:blip r:embed="rId22"/>
                     <a:stretch>
                       <a:fillRect/>
                     </a:stretch>
@@ -2775,7 +2829,7 @@
                     <pic:cNvPicPr/>
                   </pic:nvPicPr>
                   <pic:blipFill>
-                    <a:blip r:embed="rId22"/>
+                    <a:blip r:embed="rId23"/>
                     <a:stretch>
                       <a:fillRect/>
                     </a:stretch>
@@ -2817,8 +2871,224 @@
           <w:sz w:val="22"/>
           <w:szCs w:val="24"/>
         </w:rPr>
+        <w:t>Linux Command Challenge</w:t>
+      </w:r>
+    </w:p>
+    <w:p>
+      <w:pPr>
+        <w:pStyle w:val="ListParagraph"/>
+        <w:numPr>
+          <w:ilvl w:val="1"/>
+          <w:numId w:val="1"/>
+        </w:numPr>
+        <w:rPr>
+          <w:b/>
+          <w:bCs/>
+          <w:sz w:val="22"/>
+          <w:szCs w:val="24"/>
+        </w:rPr>
+      </w:pPr>
+      <w:r>
+        <w:rPr>
+          <w:b/>
+          <w:bCs/>
+          <w:sz w:val="22"/>
+          <w:szCs w:val="24"/>
+        </w:rPr>
+        <w:t>Create the following final directory structure without using any graphical interface:</w:t>
+      </w:r>
+    </w:p>
+    <w:p>
+      <w:pPr>
+        <w:pStyle w:val="ListParagraph"/>
+        <w:numPr>
+          <w:ilvl w:val="2"/>
+          <w:numId w:val="1"/>
+        </w:numPr>
+        <w:rPr>
+          <w:b/>
+          <w:bCs/>
+          <w:sz w:val="22"/>
+          <w:szCs w:val="24"/>
+        </w:rPr>
+      </w:pPr>
+      <w:r>
+        <w:rPr>
+          <w:b/>
+          <w:bCs/>
+          <w:sz w:val="22"/>
+          <w:szCs w:val="24"/>
+        </w:rPr>
+        <w:t>Student</w:t>
+      </w:r>
+    </w:p>
+    <w:p>
+      <w:pPr>
+        <w:pStyle w:val="ListParagraph"/>
+        <w:numPr>
+          <w:ilvl w:val="3"/>
+          <w:numId w:val="1"/>
+        </w:numPr>
+        <w:rPr>
+          <w:b/>
+          <w:bCs/>
+          <w:sz w:val="22"/>
+          <w:szCs w:val="24"/>
+        </w:rPr>
+      </w:pPr>
+      <w:r>
+        <w:rPr>
+          <w:b/>
+          <w:bCs/>
+          <w:sz w:val="22"/>
+          <w:szCs w:val="24"/>
+        </w:rPr>
+        <w:t>Programs</w:t>
+      </w:r>
+    </w:p>
+    <w:p>
+      <w:pPr>
+        <w:pStyle w:val="ListParagraph"/>
+        <w:numPr>
+          <w:ilvl w:val="3"/>
+          <w:numId w:val="1"/>
+        </w:numPr>
+        <w:rPr>
+          <w:b/>
+          <w:bCs/>
+          <w:sz w:val="22"/>
+          <w:szCs w:val="24"/>
+        </w:rPr>
+      </w:pPr>
+      <w:r>
+        <w:rPr>
+          <w:b/>
+          <w:bCs/>
+          <w:sz w:val="22"/>
+          <w:szCs w:val="24"/>
+        </w:rPr>
+        <w:t>cpp.cpp</w:t>
+      </w:r>
+    </w:p>
+    <w:p>
+      <w:pPr>
+        <w:pStyle w:val="ListParagraph"/>
+        <w:numPr>
+          <w:ilvl w:val="3"/>
+          <w:numId w:val="1"/>
+        </w:numPr>
+        <w:rPr>
+          <w:b/>
+          <w:bCs/>
+          <w:sz w:val="22"/>
+          <w:szCs w:val="24"/>
+        </w:rPr>
+      </w:pPr>
+      <w:r>
+        <w:rPr>
+          <w:b/>
+          <w:bCs/>
+          <w:sz w:val="22"/>
+          <w:szCs w:val="24"/>
+        </w:rPr>
         <w:lastRenderedPageBreak/>
-        <w:t>Linux Command Challenge</w:t>
+        <w:t>python.py</w:t>
+      </w:r>
+    </w:p>
+    <w:p>
+      <w:pPr>
+        <w:pStyle w:val="ListParagraph"/>
+        <w:numPr>
+          <w:ilvl w:val="2"/>
+          <w:numId w:val="1"/>
+        </w:numPr>
+        <w:rPr>
+          <w:b/>
+          <w:bCs/>
+          <w:sz w:val="22"/>
+          <w:szCs w:val="24"/>
+        </w:rPr>
+      </w:pPr>
+      <w:r>
+        <w:rPr>
+          <w:b/>
+          <w:bCs/>
+          <w:sz w:val="22"/>
+          <w:szCs w:val="24"/>
+        </w:rPr>
+        <w:t>Documents</w:t>
+      </w:r>
+    </w:p>
+    <w:p>
+      <w:pPr>
+        <w:pStyle w:val="ListParagraph"/>
+        <w:numPr>
+          <w:ilvl w:val="3"/>
+          <w:numId w:val="1"/>
+        </w:numPr>
+        <w:rPr>
+          <w:b/>
+          <w:bCs/>
+          <w:sz w:val="22"/>
+          <w:szCs w:val="24"/>
+        </w:rPr>
+      </w:pPr>
+      <w:r>
+        <w:rPr>
+          <w:b/>
+          <w:bCs/>
+          <w:sz w:val="22"/>
+          <w:szCs w:val="24"/>
+        </w:rPr>
+        <w:t>resume.txt</w:t>
+      </w:r>
+    </w:p>
+    <w:p>
+      <w:pPr>
+        <w:pStyle w:val="ListParagraph"/>
+        <w:numPr>
+          <w:ilvl w:val="2"/>
+          <w:numId w:val="1"/>
+        </w:numPr>
+        <w:rPr>
+          <w:b/>
+          <w:bCs/>
+          <w:sz w:val="22"/>
+          <w:szCs w:val="24"/>
+        </w:rPr>
+      </w:pPr>
+      <w:r>
+        <w:rPr>
+          <w:b/>
+          <w:bCs/>
+          <w:sz w:val="22"/>
+          <w:szCs w:val="24"/>
+        </w:rPr>
+        <w:t>Backup</w:t>
+      </w:r>
+    </w:p>
+    <w:p>
+      <w:pPr>
+        <w:pStyle w:val="ListParagraph"/>
+        <w:numPr>
+          <w:ilvl w:val="3"/>
+          <w:numId w:val="1"/>
+        </w:numPr>
+        <w:rPr>
+          <w:b/>
+          <w:bCs/>
+          <w:sz w:val="22"/>
+          <w:szCs w:val="24"/>
+        </w:rPr>
+      </w:pPr>
+      <w:r>
+        <w:rPr>
+          <w:b/>
+          <w:bCs/>
+          <w:sz w:val="22"/>
+          <w:szCs w:val="24"/>
+        </w:rPr>
+        <w:t>resume_backup.txt</w:t>
       </w:r>
     </w:p>
     <w:p>
@@ -2842,7 +3112,7 @@
           <w:sz w:val="22"/>
           <w:szCs w:val="24"/>
         </w:rPr>
-        <w:t>Create the following final directory structure without using any graphical interface:</w:t>
+        <w:t>Requirements:</w:t>
       </w:r>
     </w:p>
     <w:p>
@@ -2866,79 +3136,7 @@
           <w:sz w:val="22"/>
           <w:szCs w:val="24"/>
         </w:rPr>
-        <w:t>Student</w:t>
-      </w:r>
-    </w:p>
-    <w:p>
-      <w:pPr>
-        <w:pStyle w:val="ListParagraph"/>
-        <w:numPr>
-          <w:ilvl w:val="3"/>
-          <w:numId w:val="1"/>
-        </w:numPr>
-        <w:rPr>
-          <w:b/>
-          <w:bCs/>
-          <w:sz w:val="22"/>
-          <w:szCs w:val="24"/>
-        </w:rPr>
-      </w:pPr>
-      <w:r>
-        <w:rPr>
-          <w:b/>
-          <w:bCs/>
-          <w:sz w:val="22"/>
-          <w:szCs w:val="24"/>
-        </w:rPr>
-        <w:t>Programs</w:t>
-      </w:r>
-    </w:p>
-    <w:p>
-      <w:pPr>
-        <w:pStyle w:val="ListParagraph"/>
-        <w:numPr>
-          <w:ilvl w:val="3"/>
-          <w:numId w:val="1"/>
-        </w:numPr>
-        <w:rPr>
-          <w:b/>
-          <w:bCs/>
-          <w:sz w:val="22"/>
-          <w:szCs w:val="24"/>
-        </w:rPr>
-      </w:pPr>
-      <w:r>
-        <w:rPr>
-          <w:b/>
-          <w:bCs/>
-          <w:sz w:val="22"/>
-          <w:szCs w:val="24"/>
-        </w:rPr>
-        <w:t>cpp.cpp</w:t>
-      </w:r>
-    </w:p>
-    <w:p>
-      <w:pPr>
-        <w:pStyle w:val="ListParagraph"/>
-        <w:numPr>
-          <w:ilvl w:val="3"/>
-          <w:numId w:val="1"/>
-        </w:numPr>
-        <w:rPr>
-          <w:b/>
-          <w:bCs/>
-          <w:sz w:val="22"/>
-          <w:szCs w:val="24"/>
-        </w:rPr>
-      </w:pPr>
-      <w:r>
-        <w:rPr>
-          <w:b/>
-          <w:bCs/>
-          <w:sz w:val="22"/>
-          <w:szCs w:val="24"/>
-        </w:rPr>
-        <w:t>python.py</w:t>
+        <w:t>Create all required directories.</w:t>
       </w:r>
     </w:p>
     <w:p>
@@ -2962,31 +3160,7 @@
           <w:sz w:val="22"/>
           <w:szCs w:val="24"/>
         </w:rPr>
-        <w:t>Documents</w:t>
-      </w:r>
-    </w:p>
-    <w:p>
-      <w:pPr>
-        <w:pStyle w:val="ListParagraph"/>
-        <w:numPr>
-          <w:ilvl w:val="3"/>
-          <w:numId w:val="1"/>
-        </w:numPr>
-        <w:rPr>
-          <w:b/>
-          <w:bCs/>
-          <w:sz w:val="22"/>
-          <w:szCs w:val="24"/>
-        </w:rPr>
-      </w:pPr>
-      <w:r>
-        <w:rPr>
-          <w:b/>
-          <w:bCs/>
-          <w:sz w:val="22"/>
-          <w:szCs w:val="24"/>
-        </w:rPr>
-        <w:t>resume.txt</w:t>
+        <w:t>Create all required files.</w:t>
       </w:r>
     </w:p>
     <w:p>
@@ -3010,55 +3184,7 @@
           <w:sz w:val="22"/>
           <w:szCs w:val="24"/>
         </w:rPr>
-        <w:t>Backup</w:t>
-      </w:r>
-    </w:p>
-    <w:p>
-      <w:pPr>
-        <w:pStyle w:val="ListParagraph"/>
-        <w:numPr>
-          <w:ilvl w:val="3"/>
-          <w:numId w:val="1"/>
-        </w:numPr>
-        <w:rPr>
-          <w:b/>
-          <w:bCs/>
-          <w:sz w:val="22"/>
-          <w:szCs w:val="24"/>
-        </w:rPr>
-      </w:pPr>
-      <w:r>
-        <w:rPr>
-          <w:b/>
-          <w:bCs/>
-          <w:sz w:val="22"/>
-          <w:szCs w:val="24"/>
-        </w:rPr>
-        <w:t>resume_backup.txt</w:t>
-      </w:r>
-    </w:p>
-    <w:p>
-      <w:pPr>
-        <w:pStyle w:val="ListParagraph"/>
-        <w:numPr>
-          <w:ilvl w:val="1"/>
-          <w:numId w:val="1"/>
-        </w:numPr>
-        <w:rPr>
-          <w:b/>
-          <w:bCs/>
-          <w:sz w:val="22"/>
-          <w:szCs w:val="24"/>
-        </w:rPr>
-      </w:pPr>
-      <w:r>
-        <w:rPr>
-          <w:b/>
-          <w:bCs/>
-          <w:sz w:val="22"/>
-          <w:szCs w:val="24"/>
-        </w:rPr>
-        <w:t>Requirements:</w:t>
+        <w:t>Add suitable text to resume.txt.</w:t>
       </w:r>
     </w:p>
     <w:p>
@@ -3082,7 +3208,7 @@
           <w:sz w:val="22"/>
           <w:szCs w:val="24"/>
         </w:rPr>
-        <w:t>Create all required directories.</w:t>
+        <w:t>Copy the file into the Backup directory.</w:t>
       </w:r>
     </w:p>
     <w:p>
@@ -3106,7 +3232,7 @@
           <w:sz w:val="22"/>
           <w:szCs w:val="24"/>
         </w:rPr>
-        <w:t>Create all required files.</w:t>
+        <w:t>Rename the copied file to resume backup.txt.</w:t>
       </w:r>
     </w:p>
     <w:p>
@@ -3130,7 +3256,7 @@
           <w:sz w:val="22"/>
           <w:szCs w:val="24"/>
         </w:rPr>
-        <w:t>Add suitable text to resume.txt.</w:t>
+        <w:t>Remove any unnecessary files created during the process.</w:t>
       </w:r>
     </w:p>
     <w:p>
@@ -3154,7 +3280,7 @@
           <w:sz w:val="22"/>
           <w:szCs w:val="24"/>
         </w:rPr>
-        <w:t>Copy the file into the Backup directory.</w:t>
+        <w:t>Display the final directory structure.</w:t>
       </w:r>
     </w:p>
     <w:p>
@@ -3178,78 +3304,6 @@
           <w:sz w:val="22"/>
           <w:szCs w:val="24"/>
         </w:rPr>
-        <w:t>Rename the copied file to resume backup.txt.</w:t>
-      </w:r>
-    </w:p>
-    <w:p>
-      <w:pPr>
-        <w:pStyle w:val="ListParagraph"/>
-        <w:numPr>
-          <w:ilvl w:val="2"/>
-          <w:numId w:val="1"/>
-        </w:numPr>
-        <w:rPr>
-          <w:b/>
-          <w:bCs/>
-          <w:sz w:val="22"/>
-          <w:szCs w:val="24"/>
-        </w:rPr>
-      </w:pPr>
-      <w:r>
-        <w:rPr>
-          <w:b/>
-          <w:bCs/>
-          <w:sz w:val="22"/>
-          <w:szCs w:val="24"/>
-        </w:rPr>
-        <w:t>Remove any unnecessary files created during the process.</w:t>
-      </w:r>
-    </w:p>
-    <w:p>
-      <w:pPr>
-        <w:pStyle w:val="ListParagraph"/>
-        <w:numPr>
-          <w:ilvl w:val="2"/>
-          <w:numId w:val="1"/>
-        </w:numPr>
-        <w:rPr>
-          <w:b/>
-          <w:bCs/>
-          <w:sz w:val="22"/>
-          <w:szCs w:val="24"/>
-        </w:rPr>
-      </w:pPr>
-      <w:r>
-        <w:rPr>
-          <w:b/>
-          <w:bCs/>
-          <w:sz w:val="22"/>
-          <w:szCs w:val="24"/>
-        </w:rPr>
-        <w:t>Display the final directory structure.</w:t>
-      </w:r>
-    </w:p>
-    <w:p>
-      <w:pPr>
-        <w:pStyle w:val="ListParagraph"/>
-        <w:numPr>
-          <w:ilvl w:val="2"/>
-          <w:numId w:val="1"/>
-        </w:numPr>
-        <w:rPr>
-          <w:b/>
-          <w:bCs/>
-          <w:sz w:val="22"/>
-          <w:szCs w:val="24"/>
-        </w:rPr>
-      </w:pPr>
-      <w:r>
-        <w:rPr>
-          <w:b/>
-          <w:bCs/>
-          <w:sz w:val="22"/>
-          <w:szCs w:val="24"/>
-        </w:rPr>
         <w:t>Print the current working directory.</w:t>
       </w:r>
       <w:r>
@@ -3279,7 +3333,6 @@
           <w:sz w:val="22"/>
           <w:szCs w:val="24"/>
         </w:rPr>
-        <w:lastRenderedPageBreak/>
         <w:drawing>
           <wp:inline distT="0" distB="0" distL="0" distR="0" wp14:anchorId="18600D4E" wp14:editId="2287B59D">
             <wp:extent cx="5943600" cy="4435475"/>
@@ -3296,7 +3349,7 @@
                     <pic:cNvPicPr/>
                   </pic:nvPicPr>
                   <pic:blipFill>
-                    <a:blip r:embed="rId23"/>
+                    <a:blip r:embed="rId24"/>
                     <a:stretch>
                       <a:fillRect/>
                     </a:stretch>
@@ -3316,10 +3369,41 @@
           </wp:inline>
         </w:drawing>
       </w:r>
+      <w:r>
+        <w:rPr>
+          <w:b/>
+          <w:bCs/>
+          <w:sz w:val="22"/>
+          <w:szCs w:val="24"/>
+        </w:rPr>
+        <w:br/>
+      </w:r>
+      <w:r>
+        <w:rPr>
+          <w:b/>
+          <w:bCs/>
+          <w:sz w:val="22"/>
+          <w:szCs w:val="24"/>
+        </w:rPr>
+        <w:br/>
+        <w:t xml:space="preserve">Github Repo: </w:t>
+      </w:r>
+      <w:hyperlink r:id="rId25" w:history="1">
+        <w:r>
+          <w:rPr>
+            <w:rStyle w:val="Hyperlink"/>
+            <w:b/>
+            <w:bCs/>
+            <w:sz w:val="22"/>
+            <w:szCs w:val="24"/>
+          </w:rPr>
+          <w:t>Kunal-63/202612050-IT603</w:t>
+        </w:r>
+      </w:hyperlink>
     </w:p>
     <w:sectPr>
-      <w:headerReference w:type="default" r:id="rId24"/>
-      <w:footerReference w:type="default" r:id="rId25"/>
+      <w:headerReference w:type="default" r:id="rId26"/>
+      <w:footerReference w:type="default" r:id="rId27"/>
       <w:pgSz w:w="12240" w:h="15840"/>
       <w:pgMar w:top="1440" w:right="1440" w:bottom="1440" w:left="1440" w:header="720" w:footer="720" w:gutter="0"/>
       <w:cols w:space="720"/>

</xml_diff>